<commit_message>
Make report answers more natural
</commit_message>
<xml_diff>
--- a/reports/chest_xray_pneumonia_classification_report.docx
+++ b/reports/chest_xray_pneumonia_classification_report.docx
@@ -1355,31 +1355,31 @@
                 <w:color w:val="000000"/>
                 <w:sz w:val="21"/>
               </w:rPr>
-              <w:t>1. 为什么 PC 端使用 Vision Transformer：本 PC 机具备 CUDA GPU，ViT 能利用自注意力建模全局图像关系，且训练速度允许跑更多轮。</w:t>
-            </w:r>
-          </w:p>
-          <w:p>
-            <w:r/>
-            <w:r>
-              <w:rPr>
-                <w:rFonts w:ascii="宋体" w:hAnsi="宋体" w:eastAsia="宋体"/>
-                <w:b w:val="0"/>
-                <w:color w:val="000000"/>
-                <w:sz w:val="21"/>
-              </w:rPr>
-              <w:t>2. 为什么实验箱端没有继续使用 ViT：实验箱端主要是 CPU 环境，ViT 计算量较大，训练耗时和内存压力更高，因此选用 convnext_tiny 保证可运行。</w:t>
-            </w:r>
-          </w:p>
-          <w:p>
-            <w:r/>
-            <w:r>
-              <w:rPr>
-                <w:rFonts w:ascii="宋体" w:hAnsi="宋体" w:eastAsia="宋体"/>
-                <w:b w:val="0"/>
-                <w:color w:val="000000"/>
-                <w:sz w:val="21"/>
-              </w:rPr>
-              <w:t>3. 如何看待 Recall：Recall 表示肺炎样本被检出的比例，PC 端 Recall=0.8679，高于实验箱端 0.8113，漏检风险相对更低。</w:t>
+              <w:t>1. PC 端模型结果：PC 机有 CUDA GPU，所以可以使用 vit_b_16。这个模型能学习胸片不同区域之间的全局关系，10 轮训练只用了 33.6 秒，最后 F1 达到 0.9020。</w:t>
+            </w:r>
+          </w:p>
+          <w:p>
+            <w:r/>
+            <w:r>
+              <w:rPr>
+                <w:rFonts w:ascii="宋体" w:hAnsi="宋体" w:eastAsia="宋体"/>
+                <w:b w:val="0"/>
+                <w:color w:val="000000"/>
+                <w:sz w:val="21"/>
+              </w:rPr>
+              <w:t>2. 实验箱端模型结果：实验箱主要靠 CPU，继续跑 ViT 不太现实，时间会很长。因此实验箱端使用 convnext_tiny，虽然指标低一些，但能稳定完成迁移验证。</w:t>
+            </w:r>
+          </w:p>
+          <w:p>
+            <w:r/>
+            <w:r>
+              <w:rPr>
+                <w:rFonts w:ascii="宋体" w:hAnsi="宋体" w:eastAsia="宋体"/>
+                <w:b w:val="0"/>
+                <w:color w:val="000000"/>
+                <w:sz w:val="21"/>
+              </w:rPr>
+              <w:t>3. 指标解释：这类肺炎筛查任务不能只看 Accuracy，Recall 也很重要。PC 端 Recall 为 0.8679，高于实验箱端 0.8113，说明 PC 端 ViT 漏检肺炎样本的情况相对少一些。</w:t>
             </w:r>
           </w:p>
         </w:tc>

</xml_diff>

<commit_message>
Keep report questions with answers
</commit_message>
<xml_diff>
--- a/reports/chest_xray_pneumonia_classification_report.docx
+++ b/reports/chest_xray_pneumonia_classification_report.docx
@@ -1355,31 +1355,31 @@
                 <w:color w:val="000000"/>
                 <w:sz w:val="21"/>
               </w:rPr>
-              <w:t>1. PC 端模型结果：PC 机有 CUDA GPU，所以可以使用 vit_b_16。这个模型能学习胸片不同区域之间的全局关系，10 轮训练只用了 33.6 秒，最后 F1 达到 0.9020。</w:t>
-            </w:r>
-          </w:p>
-          <w:p>
-            <w:r/>
-            <w:r>
-              <w:rPr>
-                <w:rFonts w:ascii="宋体" w:hAnsi="宋体" w:eastAsia="宋体"/>
-                <w:b w:val="0"/>
-                <w:color w:val="000000"/>
-                <w:sz w:val="21"/>
-              </w:rPr>
-              <w:t>2. 实验箱端模型结果：实验箱主要靠 CPU，继续跑 ViT 不太现实，时间会很长。因此实验箱端使用 convnext_tiny，虽然指标低一些，但能稳定完成迁移验证。</w:t>
-            </w:r>
-          </w:p>
-          <w:p>
-            <w:r/>
-            <w:r>
-              <w:rPr>
-                <w:rFonts w:ascii="宋体" w:hAnsi="宋体" w:eastAsia="宋体"/>
-                <w:b w:val="0"/>
-                <w:color w:val="000000"/>
-                <w:sz w:val="21"/>
-              </w:rPr>
-              <w:t>3. 指标解释：这类肺炎筛查任务不能只看 Accuracy，Recall 也很重要。PC 端 Recall 为 0.8679，高于实验箱端 0.8113，说明 PC 端 ViT 漏检肺炎样本的情况相对少一些。</w:t>
+              <w:t>1. 为什么 PC 端使用 Vision Transformer？答：PC 机有 CUDA GPU，所以可以使用 vit_b_16。这个模型能学习胸片不同区域之间的全局关系，10 轮训练只用了 33.6 秒，最后 F1 达到 0.9020。</w:t>
+            </w:r>
+          </w:p>
+          <w:p>
+            <w:r/>
+            <w:r>
+              <w:rPr>
+                <w:rFonts w:ascii="宋体" w:hAnsi="宋体" w:eastAsia="宋体"/>
+                <w:b w:val="0"/>
+                <w:color w:val="000000"/>
+                <w:sz w:val="21"/>
+              </w:rPr>
+              <w:t>2. 为什么实验箱端没有继续使用 ViT？答：实验箱主要靠 CPU，继续跑 ViT 不太现实，时间会很长。因此实验箱端使用 convnext_tiny，虽然指标低一些，但能稳定完成迁移验证。</w:t>
+            </w:r>
+          </w:p>
+          <w:p>
+            <w:r/>
+            <w:r>
+              <w:rPr>
+                <w:rFonts w:ascii="宋体" w:hAnsi="宋体" w:eastAsia="宋体"/>
+                <w:b w:val="0"/>
+                <w:color w:val="000000"/>
+                <w:sz w:val="21"/>
+              </w:rPr>
+              <w:t>3. 如何看待 Recall 指标？答：这类肺炎筛查任务不能只看 Accuracy，Recall 也很重要。PC 端 Recall 为 0.8679，高于实验箱端 0.8113，说明 PC 端 ViT 漏检肺炎样本的情况相对少一些。</w:t>
             </w:r>
           </w:p>
         </w:tc>

</xml_diff>

<commit_message>
Show report answers separately
</commit_message>
<xml_diff>
--- a/reports/chest_xray_pneumonia_classification_report.docx
+++ b/reports/chest_xray_pneumonia_classification_report.docx
@@ -746,7 +746,7 @@
                 <w:rFonts w:ascii="宋体" w:hAnsi="宋体" w:eastAsia="宋体"/>
                 <w:b w:val="0"/>
                 <w:color w:val="000000"/>
-                <w:sz w:val="21"/>
+                <w:sz w:val="20"/>
               </w:rPr>
               <w:t>胸部 X 光片肺炎分类</w:t>
             </w:r>
@@ -787,7 +787,7 @@
                 <w:rFonts w:ascii="宋体" w:hAnsi="宋体" w:eastAsia="宋体"/>
                 <w:b w:val="0"/>
                 <w:color w:val="000000"/>
-                <w:sz w:val="21"/>
+                <w:sz w:val="20"/>
               </w:rPr>
               <w:t>读取胸部 X 光图像数据，完成 NORMAL 与 PNEUMONIA 二分类模型训练。</w:t>
             </w:r>
@@ -799,7 +799,7 @@
                 <w:rFonts w:ascii="宋体" w:hAnsi="宋体" w:eastAsia="宋体"/>
                 <w:b w:val="0"/>
                 <w:color w:val="000000"/>
-                <w:sz w:val="21"/>
+                <w:sz w:val="20"/>
               </w:rPr>
               <w:t>掌握图像预处理、迁移学习、训练验证监控和测试集评估流程。</w:t>
             </w:r>
@@ -811,7 +811,7 @@
                 <w:rFonts w:ascii="宋体" w:hAnsi="宋体" w:eastAsia="宋体"/>
                 <w:b w:val="0"/>
                 <w:color w:val="000000"/>
-                <w:sz w:val="21"/>
+                <w:sz w:val="20"/>
               </w:rPr>
               <w:t>比较 PC 端 CUDA 环境下 Vision Transformer 与实验箱 CPU 环境下 ConvNeXt Tiny 的运行差异。</w:t>
             </w:r>
@@ -852,7 +852,7 @@
                 <w:rFonts w:ascii="宋体" w:hAnsi="宋体" w:eastAsia="宋体"/>
                 <w:b w:val="0"/>
                 <w:color w:val="000000"/>
-                <w:sz w:val="21"/>
+                <w:sz w:val="20"/>
               </w:rPr>
               <w:t>1. 数据组织：train/NORMAL: 33 张；train/PNEUMONIA: 25 张；val/NORMAL: 8 张；val/PNEUMONIA: 8 张；test/NORMAL: 58 张；test/PNEUMONIA: 53 张。</w:t>
             </w:r>
@@ -864,7 +864,7 @@
                 <w:rFonts w:ascii="宋体" w:hAnsi="宋体" w:eastAsia="宋体"/>
                 <w:b w:val="0"/>
                 <w:color w:val="000000"/>
-                <w:sz w:val="21"/>
+                <w:sz w:val="20"/>
               </w:rPr>
               <w:t>2. 图像预处理：统一尺寸、张量化和归一化，构建训练集、验证集和测试集 DataLoader。</w:t>
             </w:r>
@@ -876,7 +876,7 @@
                 <w:rFonts w:ascii="宋体" w:hAnsi="宋体" w:eastAsia="宋体"/>
                 <w:b w:val="0"/>
                 <w:color w:val="000000"/>
-                <w:sz w:val="21"/>
+                <w:sz w:val="20"/>
               </w:rPr>
               <w:t>3. 模型训练：PC 端使用 vit_b_16 训练 10 轮；实验箱端使用 convnext_tiny 训练 5 轮。</w:t>
             </w:r>
@@ -888,7 +888,7 @@
                 <w:rFonts w:ascii="宋体" w:hAnsi="宋体" w:eastAsia="宋体"/>
                 <w:b w:val="0"/>
                 <w:color w:val="000000"/>
-                <w:sz w:val="21"/>
+                <w:sz w:val="20"/>
               </w:rPr>
               <w:t>4. 指标评估：输出 Accuracy、Precision、Recall、F1、训练曲线、混淆矩阵和测试集预测结果。</w:t>
             </w:r>
@@ -929,7 +929,7 @@
                 <w:rFonts w:ascii="宋体" w:hAnsi="宋体" w:eastAsia="宋体"/>
                 <w:b w:val="0"/>
                 <w:color w:val="000000"/>
-                <w:sz w:val="21"/>
+                <w:sz w:val="20"/>
               </w:rPr>
               <w:t>本实验是医学图像二分类任务，输入为胸部 X 光图像，输出为 NORMAL 或 PNEUMONIA。图像分类与表格分类不同，模型需要从像素中自动学习纹理、边缘、局部阴影、肺野区域变化等特征。由于课程数据量较小，如果从零开始训练深度网络，很容易过拟合，因此实验采用迁移学习思路：加载在大规模图像数据上预训练过的模型，只替换最后的分类头，再针对肺炎二分类进行微调。</w:t>
             </w:r>
@@ -941,7 +941,7 @@
                 <w:rFonts w:ascii="宋体" w:hAnsi="宋体" w:eastAsia="宋体"/>
                 <w:b w:val="0"/>
                 <w:color w:val="000000"/>
-                <w:sz w:val="21"/>
+                <w:sz w:val="20"/>
               </w:rPr>
               <w:t>PC 端使用 Vision Transformer。ViT 的核心思想是把一张图像切分为固定大小的 patch，每个 patch 类似自然语言处理中的 token，再加入位置编码后送入 Transformer 编码器。自注意力机制会计算不同 patch 之间的关联，因此模型不仅能关注局部纹理，也能学习肺部区域之间的全局关系。ViT 的计算量相对较大，更依赖 GPU，所以本机 CUDA 环境适合使用它进行实验。</w:t>
             </w:r>
@@ -953,7 +953,7 @@
                 <w:rFonts w:ascii="宋体" w:hAnsi="宋体" w:eastAsia="宋体"/>
                 <w:b w:val="0"/>
                 <w:color w:val="000000"/>
-                <w:sz w:val="21"/>
+                <w:sz w:val="20"/>
               </w:rPr>
               <w:t>实验箱端使用 ConvNeXt Tiny。ConvNeXt 是在传统卷积网络基础上吸收现代网络设计思想得到的模型，仍然保留卷积对局部结构建模的优势，同时训练和推理开销比 ViT 更可控。实验箱端主要使用 CPU，若强行使用 ViT，训练时间会明显拉长，甚至影响实验能否顺利完成，因此选择 convnext_tiny 更符合迁移环境。</w:t>
             </w:r>
@@ -965,7 +965,7 @@
                 <w:rFonts w:ascii="宋体" w:hAnsi="宋体" w:eastAsia="宋体"/>
                 <w:b w:val="0"/>
                 <w:color w:val="000000"/>
-                <w:sz w:val="21"/>
+                <w:sz w:val="20"/>
               </w:rPr>
               <w:t>评价指标方面，Accuracy 反映整体分类正确率，Precision 关注预测为肺炎的样本中有多少是真的肺炎，Recall 关注真实肺炎样本有多少被检出，F1 综合 Precision 和 Recall。医学筛查任务通常不能只看 Accuracy，因为漏检肺炎样本会带来更高风险，所以报告中特别比较了 Recall 和 F1。</w:t>
             </w:r>
@@ -1047,7 +1047,7 @@
                 <w:rFonts w:ascii="宋体" w:hAnsi="宋体" w:eastAsia="宋体"/>
                 <w:b w:val="0"/>
                 <w:color w:val="000000"/>
-                <w:sz w:val="21"/>
+                <w:sz w:val="20"/>
               </w:rPr>
               <w:t>1. 将 chest_xray_pneumonia_classification/data 按 train、val、test 以及 NORMAL、PNEUMONIA 子目录组织。</w:t>
             </w:r>
@@ -1059,7 +1059,7 @@
                 <w:rFonts w:ascii="宋体" w:hAnsi="宋体" w:eastAsia="宋体"/>
                 <w:b w:val="0"/>
                 <w:color w:val="000000"/>
-                <w:sz w:val="21"/>
+                <w:sz w:val="20"/>
               </w:rPr>
               <w:t>2. 在 PC 端 conda 环境中确认 torch 2.7.1+cu118、CUDA 可用，选择 vit_b_16、batch size=8、lr=0.0001、epochs=10 运行。</w:t>
             </w:r>
@@ -1071,7 +1071,7 @@
                 <w:rFonts w:ascii="宋体" w:hAnsi="宋体" w:eastAsia="宋体"/>
                 <w:b w:val="0"/>
                 <w:color w:val="000000"/>
-                <w:sz w:val="21"/>
+                <w:sz w:val="20"/>
               </w:rPr>
               <w:t>3. 在实验箱端使用 CPU 运行 convnext_tiny、batch size=8、lr=0.0001、epochs=5，保存输出结果。</w:t>
             </w:r>
@@ -1083,7 +1083,7 @@
                 <w:rFonts w:ascii="宋体" w:hAnsi="宋体" w:eastAsia="宋体"/>
                 <w:b w:val="0"/>
                 <w:color w:val="000000"/>
-                <w:sz w:val="21"/>
+                <w:sz w:val="20"/>
               </w:rPr>
               <w:t>4. 汇总两端测试集指标和训练曲线，比较模型结构与硬件环境差异。</w:t>
             </w:r>
@@ -1095,18 +1095,18 @@
                 <w:rFonts w:ascii="宋体" w:hAnsi="宋体" w:eastAsia="宋体"/>
                 <w:b w:val="0"/>
                 <w:color w:val="000000"/>
-                <w:sz w:val="21"/>
-              </w:rPr>
-            </w:r>
-          </w:p>
-          <w:p>
-            <w:r/>
-            <w:r>
-              <w:rPr>
-                <w:rFonts w:ascii="宋体" w:hAnsi="宋体" w:eastAsia="宋体"/>
-                <w:b w:val="0"/>
-                <w:color w:val="000000"/>
-                <w:sz w:val="21"/>
+                <w:sz w:val="20"/>
+              </w:rPr>
+            </w:r>
+          </w:p>
+          <w:p>
+            <w:r/>
+            <w:r>
+              <w:rPr>
+                <w:rFonts w:ascii="宋体" w:hAnsi="宋体" w:eastAsia="宋体"/>
+                <w:b w:val="0"/>
+                <w:color w:val="000000"/>
+                <w:sz w:val="20"/>
               </w:rPr>
               <w:t>测试集指标：</w:t>
             </w:r>
@@ -1118,7 +1118,7 @@
                 <w:rFonts w:ascii="宋体" w:hAnsi="宋体" w:eastAsia="宋体"/>
                 <w:b w:val="0"/>
                 <w:color w:val="000000"/>
-                <w:sz w:val="21"/>
+                <w:sz w:val="20"/>
               </w:rPr>
               <w:t>PC / vit_b_16 / device=cuda / runtime=33.6s / Accuracy=0.9099 / Precision=0.9388 / Recall=0.8679 / F1=0.9020</w:t>
             </w:r>
@@ -1130,7 +1130,7 @@
                 <w:rFonts w:ascii="宋体" w:hAnsi="宋体" w:eastAsia="宋体"/>
                 <w:b w:val="0"/>
                 <w:color w:val="000000"/>
-                <w:sz w:val="21"/>
+                <w:sz w:val="20"/>
               </w:rPr>
               <w:t>实验箱 / convnext_tiny / device=cpu / runtime=397.65s / Accuracy=0.8649 / Precision=0.8958 / Recall=0.8113 / F1=0.8515</w:t>
             </w:r>
@@ -1142,18 +1142,18 @@
                 <w:rFonts w:ascii="宋体" w:hAnsi="宋体" w:eastAsia="宋体"/>
                 <w:b w:val="0"/>
                 <w:color w:val="000000"/>
-                <w:sz w:val="21"/>
-              </w:rPr>
-            </w:r>
-          </w:p>
-          <w:p>
-            <w:r/>
-            <w:r>
-              <w:rPr>
-                <w:rFonts w:ascii="宋体" w:hAnsi="宋体" w:eastAsia="宋体"/>
-                <w:b w:val="0"/>
-                <w:color w:val="000000"/>
-                <w:sz w:val="21"/>
+                <w:sz w:val="20"/>
+              </w:rPr>
+            </w:r>
+          </w:p>
+          <w:p>
+            <w:r/>
+            <w:r>
+              <w:rPr>
+                <w:rFonts w:ascii="宋体" w:hAnsi="宋体" w:eastAsia="宋体"/>
+                <w:b w:val="0"/>
+                <w:color w:val="000000"/>
+                <w:sz w:val="20"/>
               </w:rPr>
               <w:t>PC 端 ViT 的 F1 为 0.9020，高于实验箱端 ConvNeXt Tiny 的 0.8515；PC 端运行 10 轮仅 33.6 秒，实验箱 CPU 运行 5 轮耗时 397.65 秒。</w:t>
             </w:r>
@@ -1353,33 +1353,69 @@
                 <w:rFonts w:ascii="宋体" w:hAnsi="宋体" w:eastAsia="宋体"/>
                 <w:b w:val="0"/>
                 <w:color w:val="000000"/>
-                <w:sz w:val="21"/>
-              </w:rPr>
-              <w:t>1. 为什么 PC 端使用 Vision Transformer？答：PC 机有 CUDA GPU，所以可以使用 vit_b_16。这个模型能学习胸片不同区域之间的全局关系，10 轮训练只用了 33.6 秒，最后 F1 达到 0.9020。</w:t>
-            </w:r>
-          </w:p>
-          <w:p>
-            <w:r/>
-            <w:r>
-              <w:rPr>
-                <w:rFonts w:ascii="宋体" w:hAnsi="宋体" w:eastAsia="宋体"/>
-                <w:b w:val="0"/>
-                <w:color w:val="000000"/>
-                <w:sz w:val="21"/>
-              </w:rPr>
-              <w:t>2. 为什么实验箱端没有继续使用 ViT？答：实验箱主要靠 CPU，继续跑 ViT 不太现实，时间会很长。因此实验箱端使用 convnext_tiny，虽然指标低一些，但能稳定完成迁移验证。</w:t>
-            </w:r>
-          </w:p>
-          <w:p>
-            <w:r/>
-            <w:r>
-              <w:rPr>
-                <w:rFonts w:ascii="宋体" w:hAnsi="宋体" w:eastAsia="宋体"/>
-                <w:b w:val="0"/>
-                <w:color w:val="000000"/>
-                <w:sz w:val="21"/>
-              </w:rPr>
-              <w:t>3. 如何看待 Recall 指标？答：这类肺炎筛查任务不能只看 Accuracy，Recall 也很重要。PC 端 Recall 为 0.8679，高于实验箱端 0.8113，说明 PC 端 ViT 漏检肺炎样本的情况相对少一些。</w:t>
+                <w:sz w:val="20"/>
+              </w:rPr>
+              <w:t>1. 为什么 PC 端使用 Vision Transformer？</w:t>
+            </w:r>
+          </w:p>
+          <w:p>
+            <w:r/>
+            <w:r>
+              <w:rPr>
+                <w:rFonts w:ascii="宋体" w:hAnsi="宋体" w:eastAsia="宋体"/>
+                <w:b w:val="0"/>
+                <w:color w:val="000000"/>
+                <w:sz w:val="20"/>
+              </w:rPr>
+              <w:t>答案：PC 机有 CUDA GPU，所以可以使用 vit_b_16。这个模型能学习胸片不同区域之间的全局关系，10 轮训练只用了 33.6 秒，最后 F1 达到 0.9020。</w:t>
+            </w:r>
+          </w:p>
+          <w:p>
+            <w:r/>
+            <w:r>
+              <w:rPr>
+                <w:rFonts w:ascii="宋体" w:hAnsi="宋体" w:eastAsia="宋体"/>
+                <w:b w:val="0"/>
+                <w:color w:val="000000"/>
+                <w:sz w:val="20"/>
+              </w:rPr>
+              <w:t>2. 为什么实验箱端没有继续使用 ViT？</w:t>
+            </w:r>
+          </w:p>
+          <w:p>
+            <w:r/>
+            <w:r>
+              <w:rPr>
+                <w:rFonts w:ascii="宋体" w:hAnsi="宋体" w:eastAsia="宋体"/>
+                <w:b w:val="0"/>
+                <w:color w:val="000000"/>
+                <w:sz w:val="20"/>
+              </w:rPr>
+              <w:t>答案：实验箱主要靠 CPU，继续跑 ViT 不太现实，时间会很长。因此实验箱端使用 convnext_tiny，虽然指标低一些，但能稳定完成迁移验证。</w:t>
+            </w:r>
+          </w:p>
+          <w:p>
+            <w:r/>
+            <w:r>
+              <w:rPr>
+                <w:rFonts w:ascii="宋体" w:hAnsi="宋体" w:eastAsia="宋体"/>
+                <w:b w:val="0"/>
+                <w:color w:val="000000"/>
+                <w:sz w:val="20"/>
+              </w:rPr>
+              <w:t>3. 如何看待 Recall 指标？</w:t>
+            </w:r>
+          </w:p>
+          <w:p>
+            <w:r/>
+            <w:r>
+              <w:rPr>
+                <w:rFonts w:ascii="宋体" w:hAnsi="宋体" w:eastAsia="宋体"/>
+                <w:b w:val="0"/>
+                <w:color w:val="000000"/>
+                <w:sz w:val="20"/>
+              </w:rPr>
+              <w:t>答案：这类肺炎筛查任务不能只看 Accuracy，Recall 也很重要。PC 端 Recall 为 0.8679，高于实验箱端 0.8113，说明 PC 端 ViT 漏检肺炎样本的情况相对少一些。</w:t>
             </w:r>
           </w:p>
         </w:tc>
@@ -1417,7 +1453,7 @@
                 <w:rFonts w:ascii="宋体" w:hAnsi="宋体" w:eastAsia="宋体"/>
                 <w:b w:val="0"/>
                 <w:color w:val="000000"/>
-                <w:sz w:val="21"/>
+                <w:sz w:val="20"/>
               </w:rPr>
               <w:t>本次实验的真实过程比单纯训练一个图像分类模型要复杂一些。开始时我们先按教程完成实验箱迁移准备，把数据集、脚本、依赖和输出目录整理到 GitHub 仓库。后来在 PC 端检查 conda 环境时发现本机其实有 CUDA，可以使用 torch 2.7.1+cu118 和 RTX 4070 Laptop GPU，因此模型选择不必完全受实验箱限制。于是 PC 端改用 vit_b_16 训练 10 轮，实验箱端则继续使用更稳妥的 convnext_tiny 在 CPU 上跑通流程。</w:t>
             </w:r>
@@ -1429,21 +1465,21 @@
                 <w:rFonts w:ascii="宋体" w:hAnsi="宋体" w:eastAsia="宋体"/>
                 <w:b w:val="0"/>
                 <w:color w:val="000000"/>
-                <w:sz w:val="21"/>
-              </w:rPr>
-              <w:t>模型选型上的体会比较明显。ViT 是更前沿的视觉模型，能够通过自注意力学习不同图像 patch 之间的全局关系，用在胸片任务上有一定优势；但它对算力要求高，如果放到实验箱 CPU 上训练，时间成本会很大。ConvNeXt Tiny 虽然不是 Transformer，但结构轻一些，保留了卷积网络对局部纹理和边缘的建模能力，更适合实验箱端验证可迁移性。最终 PC 端 ViT 的 Accuracy 为 0.9099、F1 为 0.9020，实验箱端 ConvNeXt Tiny 的 Accuracy 为 0.8649、F1 为 0.8515，结果也符合这种硬件和模型差异。</w:t>
-            </w:r>
-          </w:p>
-          <w:p>
-            <w:r/>
-            <w:r>
-              <w:rPr>
-                <w:rFonts w:ascii="宋体" w:hAnsi="宋体" w:eastAsia="宋体"/>
-                <w:b w:val="0"/>
-                <w:color w:val="000000"/>
-                <w:sz w:val="21"/>
-              </w:rPr>
-              <w:t>实验中遇到的问题主要有三个。第一是环境判断不能凭感觉，之前误以为本机不能用 CUDA，后来检查现有 conda 环境才确认 GPU 可用；第二是实验箱没有方便的浏览器和 GitHub 登录环境，结果传回时需要通过文件夹整理、分支或手动拷贝解决；第三是数据量比较小，验证集只有 16 张图像，训练过程中验证 F1 波动很大，所以最终分析不能只看某一轮验证结果，而要结合测试集指标和混淆矩阵。通过这次实验，我更理解医学 AI 实验不是模型越新越好，而是要把数据规模、硬件条件、运行时间、迁移难度和评价指标一起考虑，选择能真实落地并能解释清楚的方案。</w:t>
+                <w:sz w:val="20"/>
+              </w:rPr>
+              <w:t>模型选型上的体会比较明显。ViT 是更前沿的视觉模型，能够通过自注意力学习不同图像 patch 之间的全局关系，用在胸片任务上有一定优势；但它对算力要求高，如果放到实验箱 CPU 上训练，时间成本会很大。ConvNeXt Tiny 虽然不是 Transformer，但结构轻一些，更适合实验箱端验证可迁移性。最终 PC 端 ViT 的 Accuracy 为 0.9099、F1 为 0.9020，实验箱端 ConvNeXt Tiny 的 Accuracy 为 0.8649、F1 为 0.8515，结果也符合这种硬件和模型差异。</w:t>
+            </w:r>
+          </w:p>
+          <w:p>
+            <w:r/>
+            <w:r>
+              <w:rPr>
+                <w:rFonts w:ascii="宋体" w:hAnsi="宋体" w:eastAsia="宋体"/>
+                <w:b w:val="0"/>
+                <w:color w:val="000000"/>
+                <w:sz w:val="20"/>
+              </w:rPr>
+              <w:t>实验中遇到的问题主要有三个。第一是环境判断不能凭感觉，之前误以为本机不能用 CUDA，后来检查 conda 环境才确认 GPU 可用；第二是实验箱没有方便的浏览器和 GitHub 登录环境，结果传回时需要通过文件夹整理或手动拷贝解决；第三是数据量比较小，验证集只有 16 张图像，训练过程中的验证 F1 波动很大，所以最终不能只看某一轮验证结果。通过这次实验，我更理解医学 AI 实验要把模型、数据、硬件和迁移放在一起考虑。</w:t>
             </w:r>
           </w:p>
         </w:tc>

</xml_diff>